<commit_message>
Added the OutflowB logic
</commit_message>
<xml_diff>
--- a/descrizione modello.docx
+++ b/descrizione modello.docx
@@ -11308,7 +11308,55 @@
           <w:sz w:val="24"/>
           <w:szCs w:val="24"/>
         </w:rPr>
-        <w:t>D’(a)tot, e quello che devo soddisfare con la traversa)</w:t>
+        <w:t>D’(a)tot, e quello che devo soddisfare con la traversa</w:t>
+      </w:r>
+      <w:r>
+        <w:rPr>
+          <w:color w:val="EE0000"/>
+          <w:sz w:val="24"/>
+          <w:szCs w:val="24"/>
+        </w:rPr>
+        <w:t xml:space="preserve"> </w:t>
+      </w:r>
+      <w:r>
+        <w:rPr>
+          <w:color w:val="EE0000"/>
+          <w:sz w:val="24"/>
+          <w:szCs w:val="24"/>
+        </w:rPr>
+        <w:t>D’(</w:t>
+      </w:r>
+      <w:r>
+        <w:rPr>
+          <w:color w:val="EE0000"/>
+          <w:sz w:val="24"/>
+          <w:szCs w:val="24"/>
+        </w:rPr>
+        <w:t>b</w:t>
+      </w:r>
+      <w:r>
+        <w:rPr>
+          <w:color w:val="EE0000"/>
+          <w:sz w:val="24"/>
+          <w:szCs w:val="24"/>
+        </w:rPr>
+        <w:t xml:space="preserve"> </w:t>
+      </w:r>
+      <w:r>
+        <w:rPr>
+          <w:color w:val="EE0000"/>
+          <w:sz w:val="24"/>
+          <w:szCs w:val="24"/>
+        </w:rPr>
+        <w:t>)tot</w:t>
+      </w:r>
+      <w:r>
+        <w:rPr>
+          <w:color w:val="EE0000"/>
+          <w:sz w:val="24"/>
+          <w:szCs w:val="24"/>
+        </w:rPr>
+        <w:t>)</w:t>
       </w:r>
     </w:p>
     <w:p>
@@ -13027,7 +13075,6 @@
         </w:rPr>
         <w:t xml:space="preserve"> richiesta di un prelievo aggiuntivo </w:t>
       </w:r>
-      <w:proofErr w:type="gramStart"/>
       <w:r>
         <w:rPr>
           <w:sz w:val="24"/>
@@ -13041,9 +13088,8 @@
           <w:sz w:val="24"/>
           <w:szCs w:val="24"/>
         </w:rPr>
-        <w:t xml:space="preserve"> ;</w:t>
-      </w:r>
-      <w:proofErr w:type="gramEnd"/>
+        <w:t>;</w:t>
+      </w:r>
       <w:r>
         <w:rPr>
           <w:rFonts w:eastAsiaTheme="minorEastAsia"/>
@@ -13173,6 +13219,47 @@
     <w:p>
       <w:pPr>
         <w:spacing w:after="0" w:line="360" w:lineRule="auto"/>
+        <w:jc w:val="center"/>
+        <w:rPr>
+          <w:rFonts w:eastAsiaTheme="minorEastAsia"/>
+          <w:color w:val="EE0000"/>
+          <w:sz w:val="24"/>
+          <w:szCs w:val="24"/>
+        </w:rPr>
+      </w:pPr>
+      <w:r>
+        <w:rPr>
+          <w:rFonts w:eastAsiaTheme="minorEastAsia"/>
+          <w:color w:val="EE0000"/>
+          <w:sz w:val="24"/>
+          <w:szCs w:val="24"/>
+        </w:rPr>
+        <w:t xml:space="preserve">(Assumo che P’(r) sia in realtà </w:t>
+      </w:r>
+      <w:proofErr w:type="spellStart"/>
+      <w:r>
+        <w:rPr>
+          <w:rFonts w:eastAsiaTheme="minorEastAsia"/>
+          <w:color w:val="EE0000"/>
+          <w:sz w:val="24"/>
+          <w:szCs w:val="24"/>
+        </w:rPr>
+        <w:t>P’tot</w:t>
+      </w:r>
+      <w:proofErr w:type="spellEnd"/>
+      <w:r>
+        <w:rPr>
+          <w:rFonts w:eastAsiaTheme="minorEastAsia"/>
+          <w:color w:val="EE0000"/>
+          <w:sz w:val="24"/>
+          <w:szCs w:val="24"/>
+        </w:rPr>
+        <w:t>)</w:t>
+      </w:r>
+    </w:p>
+    <w:p>
+      <w:pPr>
+        <w:spacing w:after="0" w:line="360" w:lineRule="auto"/>
         <w:ind w:left="3540" w:firstLine="708"/>
         <w:jc w:val="both"/>
         <w:rPr>
@@ -13185,10 +13272,304 @@
     <w:p>
       <w:pPr>
         <w:spacing w:after="0" w:line="360" w:lineRule="auto"/>
+        <w:ind w:firstLine="708"/>
+        <w:jc w:val="both"/>
+        <w:rPr>
+          <w:rFonts w:eastAsiaTheme="minorEastAsia"/>
+          <w:sz w:val="24"/>
+          <w:szCs w:val="24"/>
+        </w:rPr>
+      </w:pPr>
+      <w:r>
+        <w:rPr>
+          <w:rFonts w:eastAsiaTheme="minorEastAsia"/>
+          <w:sz w:val="24"/>
+          <w:szCs w:val="24"/>
+        </w:rPr>
+        <w:t xml:space="preserve">Ciò </w:t>
+      </w:r>
+      <w:r>
+        <w:rPr>
+          <w:rFonts w:eastAsiaTheme="minorEastAsia"/>
+          <w:sz w:val="24"/>
+          <w:szCs w:val="24"/>
+        </w:rPr>
+        <w:t>verificato, per</w:t>
+      </w:r>
+      <w:r>
+        <w:rPr>
+          <w:rFonts w:eastAsiaTheme="minorEastAsia"/>
+          <w:sz w:val="24"/>
+          <w:szCs w:val="24"/>
+        </w:rPr>
+        <w:t xml:space="preserve"> la distribuzione annua dei prelievi </w:t>
+      </w:r>
+      <w:r>
+        <w:rPr>
+          <w:sz w:val="24"/>
+          <w:szCs w:val="24"/>
+        </w:rPr>
+        <w:t xml:space="preserve">Δ(r) </w:t>
+      </w:r>
+      <w:proofErr w:type="gramStart"/>
+      <w:r>
+        <w:rPr>
+          <w:sz w:val="24"/>
+          <w:szCs w:val="24"/>
+        </w:rPr>
+        <w:t>( o</w:t>
+      </w:r>
+      <w:proofErr w:type="gramEnd"/>
+      <w:r>
+        <w:rPr>
+          <w:sz w:val="24"/>
+          <w:szCs w:val="24"/>
+        </w:rPr>
+        <w:t xml:space="preserve"> </w:t>
+      </w:r>
+      <w:proofErr w:type="spellStart"/>
+      <w:r>
+        <w:rPr>
+          <w:sz w:val="24"/>
+          <w:szCs w:val="24"/>
+        </w:rPr>
+        <w:t>Δ’r</w:t>
+      </w:r>
+      <w:proofErr w:type="spellEnd"/>
+      <w:r>
+        <w:rPr>
+          <w:sz w:val="24"/>
+          <w:szCs w:val="24"/>
+        </w:rPr>
+        <w:t>), posto:</w:t>
+      </w:r>
+      <w:r>
+        <w:rPr>
+          <w:rFonts w:cs="Calibri"/>
+          <w:sz w:val="24"/>
+          <w:szCs w:val="24"/>
+        </w:rPr>
+        <w:t xml:space="preserve">      </w:t>
+      </w:r>
+    </w:p>
+    <w:p>
+      <w:pPr>
+        <w:spacing w:after="0" w:line="360" w:lineRule="auto"/>
         <w:ind w:left="3540" w:firstLine="708"/>
         <w:jc w:val="both"/>
         <w:rPr>
-          <w:rFonts w:eastAsiaTheme="minorEastAsia"/>
+          <w:sz w:val="24"/>
+          <w:szCs w:val="24"/>
+        </w:rPr>
+      </w:pPr>
+      <w:r>
+        <w:rPr>
+          <w:rFonts w:cs="Calibri"/>
+          <w:sz w:val="24"/>
+          <w:szCs w:val="24"/>
+        </w:rPr>
+        <w:t>α</w:t>
+      </w:r>
+      <w:r>
+        <w:rPr>
+          <w:sz w:val="24"/>
+          <w:szCs w:val="24"/>
+          <w:vertAlign w:val="subscript"/>
+        </w:rPr>
+        <w:t xml:space="preserve">5 </w:t>
+      </w:r>
+      <w:r>
+        <w:rPr>
+          <w:sz w:val="24"/>
+          <w:szCs w:val="24"/>
+        </w:rPr>
+        <w:t xml:space="preserve">= </w:t>
+      </w:r>
+      <w:r>
+        <w:rPr>
+          <w:rFonts w:cs="Calibri"/>
+          <w:sz w:val="24"/>
+          <w:szCs w:val="24"/>
+        </w:rPr>
+        <w:t xml:space="preserve">Δ </w:t>
+      </w:r>
+      <w:r>
+        <w:rPr>
+          <w:sz w:val="24"/>
+          <w:szCs w:val="24"/>
+        </w:rPr>
+        <w:t xml:space="preserve">/ </w:t>
+      </w:r>
+      <w:proofErr w:type="spellStart"/>
+      <w:r>
+        <w:rPr>
+          <w:sz w:val="24"/>
+          <w:szCs w:val="24"/>
+        </w:rPr>
+        <w:t>P’tot</w:t>
+      </w:r>
+      <w:proofErr w:type="spellEnd"/>
+      <w:r>
+        <w:rPr>
+          <w:sz w:val="24"/>
+          <w:szCs w:val="24"/>
+        </w:rPr>
+        <w:t xml:space="preserve">          </w:t>
+      </w:r>
+      <w:r>
+        <w:rPr>
+          <w:sz w:val="24"/>
+          <w:szCs w:val="24"/>
+        </w:rPr>
+        <w:t xml:space="preserve">               </w:t>
+      </w:r>
+      <w:proofErr w:type="gramStart"/>
+      <w:r>
+        <w:rPr>
+          <w:sz w:val="24"/>
+          <w:szCs w:val="24"/>
+        </w:rPr>
+        <w:t xml:space="preserve">  </w:t>
+      </w:r>
+      <w:r>
+        <w:rPr>
+          <w:sz w:val="24"/>
+          <w:szCs w:val="24"/>
+        </w:rPr>
+        <w:t xml:space="preserve"> (</w:t>
+      </w:r>
+      <w:proofErr w:type="gramEnd"/>
+      <w:r>
+        <w:rPr>
+          <w:sz w:val="24"/>
+          <w:szCs w:val="24"/>
+        </w:rPr>
+        <w:t>5.</w:t>
+      </w:r>
+      <w:r>
+        <w:rPr>
+          <w:sz w:val="24"/>
+          <w:szCs w:val="24"/>
+        </w:rPr>
+        <w:t>41)</w:t>
+      </w:r>
+    </w:p>
+    <w:p>
+      <w:pPr>
+        <w:spacing w:after="0" w:line="360" w:lineRule="auto"/>
+        <w:jc w:val="both"/>
+        <w:rPr>
+          <w:sz w:val="24"/>
+          <w:szCs w:val="24"/>
+        </w:rPr>
+      </w:pPr>
+      <w:r>
+        <w:rPr>
+          <w:sz w:val="24"/>
+          <w:szCs w:val="24"/>
+        </w:rPr>
+        <w:t>si assumerà</w:t>
+      </w:r>
+    </w:p>
+    <w:p>
+      <w:pPr>
+        <w:spacing w:after="0" w:line="360" w:lineRule="auto"/>
+        <w:ind w:left="3540" w:firstLine="708"/>
+        <w:jc w:val="both"/>
+        <w:rPr>
+          <w:sz w:val="24"/>
+          <w:szCs w:val="24"/>
+        </w:rPr>
+      </w:pPr>
+      <w:r>
+        <w:rPr>
+          <w:sz w:val="24"/>
+          <w:szCs w:val="24"/>
+        </w:rPr>
+        <w:t xml:space="preserve">Δ(r) = </w:t>
+      </w:r>
+      <w:r>
+        <w:rPr>
+          <w:rFonts w:cs="Calibri"/>
+          <w:sz w:val="24"/>
+          <w:szCs w:val="24"/>
+        </w:rPr>
+        <w:t>α</w:t>
+      </w:r>
+      <w:r>
+        <w:rPr>
+          <w:sz w:val="24"/>
+          <w:szCs w:val="24"/>
+          <w:vertAlign w:val="subscript"/>
+        </w:rPr>
+        <w:t>5</w:t>
+      </w:r>
+      <w:r>
+        <w:rPr>
+          <w:sz w:val="24"/>
+          <w:szCs w:val="24"/>
+        </w:rPr>
+        <w:t xml:space="preserve"> P</w:t>
+      </w:r>
+      <w:proofErr w:type="gramStart"/>
+      <w:r>
+        <w:rPr>
+          <w:sz w:val="24"/>
+          <w:szCs w:val="24"/>
+        </w:rPr>
+        <w:t>’( r</w:t>
+      </w:r>
+      <w:proofErr w:type="gramEnd"/>
+      <w:r>
+        <w:rPr>
+          <w:sz w:val="24"/>
+          <w:szCs w:val="24"/>
+        </w:rPr>
+        <w:t xml:space="preserve"> )      </w:t>
+      </w:r>
+      <w:r>
+        <w:rPr>
+          <w:sz w:val="24"/>
+          <w:szCs w:val="24"/>
+        </w:rPr>
+        <w:t xml:space="preserve">                </w:t>
+      </w:r>
+      <w:proofErr w:type="gramStart"/>
+      <w:r>
+        <w:rPr>
+          <w:sz w:val="24"/>
+          <w:szCs w:val="24"/>
+        </w:rPr>
+        <w:t xml:space="preserve">  </w:t>
+      </w:r>
+      <w:r>
+        <w:rPr>
+          <w:sz w:val="24"/>
+          <w:szCs w:val="24"/>
+        </w:rPr>
+        <w:t xml:space="preserve"> (</w:t>
+      </w:r>
+      <w:proofErr w:type="gramEnd"/>
+      <w:r>
+        <w:rPr>
+          <w:sz w:val="24"/>
+          <w:szCs w:val="24"/>
+        </w:rPr>
+        <w:t>5.</w:t>
+      </w:r>
+      <w:r>
+        <w:rPr>
+          <w:sz w:val="24"/>
+          <w:szCs w:val="24"/>
+        </w:rPr>
+        <w:t>42)</w:t>
+      </w:r>
+    </w:p>
+    <w:p>
+      <w:pPr>
+        <w:spacing w:after="0" w:line="360" w:lineRule="auto"/>
+        <w:jc w:val="both"/>
+        <w:rPr>
           <w:sz w:val="24"/>
           <w:szCs w:val="24"/>
         </w:rPr>
@@ -13200,51 +13581,103 @@
         <w:ind w:firstLine="708"/>
         <w:jc w:val="both"/>
         <w:rPr>
-          <w:rFonts w:eastAsiaTheme="minorEastAsia"/>
-          <w:sz w:val="24"/>
-          <w:szCs w:val="24"/>
-        </w:rPr>
-      </w:pPr>
-      <w:r>
-        <w:rPr>
-          <w:rFonts w:eastAsiaTheme="minorEastAsia"/>
-          <w:sz w:val="24"/>
-          <w:szCs w:val="24"/>
-        </w:rPr>
-        <w:t xml:space="preserve">Ciò </w:t>
-      </w:r>
-      <w:r>
-        <w:rPr>
-          <w:rFonts w:eastAsiaTheme="minorEastAsia"/>
-          <w:sz w:val="24"/>
-          <w:szCs w:val="24"/>
-        </w:rPr>
-        <w:t>verificato, per</w:t>
-      </w:r>
-      <w:r>
-        <w:rPr>
-          <w:rFonts w:eastAsiaTheme="minorEastAsia"/>
-          <w:sz w:val="24"/>
-          <w:szCs w:val="24"/>
-        </w:rPr>
-        <w:t xml:space="preserve"> la distribuzione annua dei prelievi </w:t>
-      </w:r>
-      <w:r>
-        <w:rPr>
-          <w:sz w:val="24"/>
-          <w:szCs w:val="24"/>
-        </w:rPr>
-        <w:t xml:space="preserve">Δ(r) </w:t>
-      </w:r>
-      <w:proofErr w:type="gramStart"/>
-      <w:r>
-        <w:rPr>
-          <w:sz w:val="24"/>
-          <w:szCs w:val="24"/>
-        </w:rPr>
-        <w:t>( o</w:t>
-      </w:r>
-      <w:proofErr w:type="gramEnd"/>
+          <w:sz w:val="24"/>
+          <w:szCs w:val="24"/>
+        </w:rPr>
+      </w:pPr>
+      <w:r>
+        <w:rPr>
+          <w:sz w:val="24"/>
+          <w:szCs w:val="24"/>
+        </w:rPr>
+        <w:t xml:space="preserve">La distribuzione mensile dei prelievi Δ j(r) per la generica traversa r si può assumere proporzionale ai valori del deflusso netto </w:t>
+      </w:r>
+      <w:proofErr w:type="spellStart"/>
+      <w:r>
+        <w:rPr>
+          <w:sz w:val="24"/>
+          <w:szCs w:val="24"/>
+        </w:rPr>
+        <w:t>P’j</w:t>
+      </w:r>
+      <w:proofErr w:type="spellEnd"/>
+      <w:r>
+        <w:rPr>
+          <w:sz w:val="24"/>
+          <w:szCs w:val="24"/>
+        </w:rPr>
+        <w:t>(r). Pertanto, posto:</w:t>
+      </w:r>
+    </w:p>
+    <w:p>
+      <w:pPr>
+        <w:spacing w:after="0" w:line="360" w:lineRule="auto"/>
+        <w:ind w:left="3540" w:firstLine="708"/>
+        <w:jc w:val="both"/>
+        <w:rPr>
+          <w:sz w:val="24"/>
+          <w:szCs w:val="24"/>
+        </w:rPr>
+      </w:pPr>
+      <w:r>
+        <w:rPr>
+          <w:rFonts w:cs="Calibri"/>
+          <w:sz w:val="24"/>
+          <w:szCs w:val="24"/>
+        </w:rPr>
+        <w:t>α</w:t>
+      </w:r>
+      <w:r>
+        <w:rPr>
+          <w:sz w:val="24"/>
+          <w:szCs w:val="24"/>
+          <w:vertAlign w:val="subscript"/>
+        </w:rPr>
+        <w:t xml:space="preserve">6 </w:t>
+      </w:r>
+      <w:r>
+        <w:rPr>
+          <w:sz w:val="24"/>
+          <w:szCs w:val="24"/>
+        </w:rPr>
+        <w:t xml:space="preserve">= </w:t>
+      </w:r>
+      <w:r>
+        <w:rPr>
+          <w:sz w:val="24"/>
+          <w:szCs w:val="24"/>
+        </w:rPr>
+        <w:t>Δ</w:t>
+      </w:r>
+      <w:r>
+        <w:rPr>
+          <w:sz w:val="24"/>
+          <w:szCs w:val="24"/>
+        </w:rPr>
+        <w:t>’</w:t>
+      </w:r>
+      <w:r>
+        <w:rPr>
+          <w:sz w:val="24"/>
+          <w:szCs w:val="24"/>
+        </w:rPr>
+        <w:t xml:space="preserve">(r) </w:t>
+      </w:r>
+      <w:r>
+        <w:rPr>
+          <w:sz w:val="24"/>
+          <w:szCs w:val="24"/>
+        </w:rPr>
+        <w:t>/ P’(</w:t>
+      </w:r>
+      <w:proofErr w:type="gramStart"/>
+      <w:r>
+        <w:rPr>
+          <w:sz w:val="24"/>
+          <w:szCs w:val="24"/>
+        </w:rPr>
+        <w:t xml:space="preserve">r)  </w:t>
+      </w:r>
       <w:r>
         <w:rPr>
           <w:sz w:val="24"/>
@@ -13252,13 +13685,130 @@
         </w:rPr>
         <w:t xml:space="preserve"> </w:t>
       </w:r>
+      <w:proofErr w:type="gramEnd"/>
+      <w:r>
+        <w:rPr>
+          <w:sz w:val="24"/>
+          <w:szCs w:val="24"/>
+        </w:rPr>
+        <w:t xml:space="preserve">      </w:t>
+      </w:r>
+      <w:r>
+        <w:rPr>
+          <w:sz w:val="24"/>
+          <w:szCs w:val="24"/>
+        </w:rPr>
+        <w:t xml:space="preserve">            </w:t>
+      </w:r>
+      <w:proofErr w:type="gramStart"/>
+      <w:r>
+        <w:rPr>
+          <w:sz w:val="24"/>
+          <w:szCs w:val="24"/>
+        </w:rPr>
+        <w:t xml:space="preserve">  </w:t>
+      </w:r>
+      <w:r>
+        <w:rPr>
+          <w:sz w:val="24"/>
+          <w:szCs w:val="24"/>
+        </w:rPr>
+        <w:t xml:space="preserve"> (</w:t>
+      </w:r>
+      <w:proofErr w:type="gramEnd"/>
+      <w:r>
+        <w:rPr>
+          <w:sz w:val="24"/>
+          <w:szCs w:val="24"/>
+        </w:rPr>
+        <w:t>5.</w:t>
+      </w:r>
+      <w:r>
+        <w:rPr>
+          <w:sz w:val="24"/>
+          <w:szCs w:val="24"/>
+        </w:rPr>
+        <w:t xml:space="preserve">43)    </w:t>
+      </w:r>
+    </w:p>
+    <w:p>
+      <w:pPr>
+        <w:spacing w:after="0" w:line="360" w:lineRule="auto"/>
+        <w:jc w:val="both"/>
+        <w:rPr>
+          <w:sz w:val="24"/>
+          <w:szCs w:val="24"/>
+        </w:rPr>
+      </w:pPr>
+      <w:r>
+        <w:rPr>
+          <w:sz w:val="24"/>
+          <w:szCs w:val="24"/>
+        </w:rPr>
+        <w:t>sarà:</w:t>
+      </w:r>
+    </w:p>
+    <w:p>
+      <w:pPr>
+        <w:spacing w:after="0" w:line="360" w:lineRule="auto"/>
+        <w:ind w:left="3540" w:firstLine="708"/>
+        <w:jc w:val="both"/>
+        <w:rPr>
+          <w:sz w:val="24"/>
+          <w:szCs w:val="24"/>
+        </w:rPr>
+      </w:pPr>
+      <w:r>
+        <w:rPr>
+          <w:sz w:val="24"/>
+          <w:szCs w:val="24"/>
+        </w:rPr>
+        <w:t>Δ</w:t>
+      </w:r>
+      <w:r>
+        <w:rPr>
+          <w:sz w:val="24"/>
+          <w:szCs w:val="24"/>
+        </w:rPr>
+        <w:t>’</w:t>
+      </w:r>
+      <w:r>
+        <w:rPr>
+          <w:sz w:val="24"/>
+          <w:szCs w:val="24"/>
+        </w:rPr>
+        <w:t xml:space="preserve"> j(r) =</w:t>
+      </w:r>
+      <w:r>
+        <w:rPr>
+          <w:rFonts w:cs="Calibri"/>
+          <w:sz w:val="24"/>
+          <w:szCs w:val="24"/>
+        </w:rPr>
+        <w:t xml:space="preserve"> α</w:t>
+      </w:r>
+      <w:r>
+        <w:rPr>
+          <w:sz w:val="24"/>
+          <w:szCs w:val="24"/>
+          <w:vertAlign w:val="subscript"/>
+        </w:rPr>
+        <w:t>6</w:t>
+      </w:r>
+      <w:r>
+        <w:rPr>
+          <w:sz w:val="24"/>
+          <w:szCs w:val="24"/>
+        </w:rPr>
+        <w:t xml:space="preserve"> </w:t>
+      </w:r>
       <w:proofErr w:type="spellStart"/>
       <w:r>
         <w:rPr>
           <w:sz w:val="24"/>
           <w:szCs w:val="24"/>
         </w:rPr>
-        <w:t>Δ’r</w:t>
+        <w:t>P’j</w:t>
       </w:r>
       <w:proofErr w:type="spellEnd"/>
       <w:r>
@@ -13266,102 +13816,52 @@
           <w:sz w:val="24"/>
           <w:szCs w:val="24"/>
         </w:rPr>
-        <w:t>), posto:</w:t>
-      </w:r>
-      <w:r>
-        <w:rPr>
-          <w:rFonts w:cs="Calibri"/>
-          <w:sz w:val="24"/>
-          <w:szCs w:val="24"/>
-        </w:rPr>
-        <w:t xml:space="preserve">      </w:t>
-      </w:r>
-    </w:p>
-    <w:p>
-      <w:pPr>
-        <w:spacing w:after="0" w:line="360" w:lineRule="auto"/>
-        <w:ind w:left="3540" w:firstLine="708"/>
-        <w:jc w:val="both"/>
-        <w:rPr>
-          <w:sz w:val="24"/>
-          <w:szCs w:val="24"/>
-        </w:rPr>
-      </w:pPr>
-      <w:r>
-        <w:rPr>
-          <w:rFonts w:cs="Calibri"/>
-          <w:sz w:val="24"/>
-          <w:szCs w:val="24"/>
-        </w:rPr>
-        <w:t>α</w:t>
-      </w:r>
-      <w:r>
-        <w:rPr>
-          <w:sz w:val="24"/>
-          <w:szCs w:val="24"/>
-          <w:vertAlign w:val="subscript"/>
-        </w:rPr>
-        <w:t xml:space="preserve">5 </w:t>
-      </w:r>
-      <w:r>
-        <w:rPr>
-          <w:sz w:val="24"/>
-          <w:szCs w:val="24"/>
-        </w:rPr>
-        <w:t xml:space="preserve">= </w:t>
-      </w:r>
-      <w:r>
-        <w:rPr>
-          <w:rFonts w:cs="Calibri"/>
-          <w:sz w:val="24"/>
-          <w:szCs w:val="24"/>
-        </w:rPr>
-        <w:t xml:space="preserve">Δ </w:t>
-      </w:r>
-      <w:r>
-        <w:rPr>
-          <w:sz w:val="24"/>
-          <w:szCs w:val="24"/>
-        </w:rPr>
-        <w:t xml:space="preserve">/ </w:t>
-      </w:r>
-      <w:proofErr w:type="spellStart"/>
-      <w:r>
-        <w:rPr>
-          <w:sz w:val="24"/>
-          <w:szCs w:val="24"/>
-        </w:rPr>
-        <w:t>P’tot</w:t>
-      </w:r>
-      <w:proofErr w:type="spellEnd"/>
-      <w:r>
-        <w:rPr>
-          <w:sz w:val="24"/>
-          <w:szCs w:val="24"/>
-        </w:rPr>
-        <w:t xml:space="preserve">          </w:t>
-      </w:r>
-      <w:r>
-        <w:rPr>
-          <w:sz w:val="24"/>
-          <w:szCs w:val="24"/>
-        </w:rPr>
-        <w:t xml:space="preserve">               </w:t>
-      </w:r>
-      <w:proofErr w:type="gramStart"/>
-      <w:r>
-        <w:rPr>
-          <w:sz w:val="24"/>
-          <w:szCs w:val="24"/>
-        </w:rPr>
-        <w:t xml:space="preserve">  </w:t>
-      </w:r>
-      <w:r>
-        <w:rPr>
-          <w:sz w:val="24"/>
-          <w:szCs w:val="24"/>
-        </w:rPr>
-        <w:t xml:space="preserve"> (</w:t>
+        <w:t>(</w:t>
+      </w:r>
+      <w:proofErr w:type="gramStart"/>
+      <w:r>
+        <w:rPr>
+          <w:sz w:val="24"/>
+          <w:szCs w:val="24"/>
+        </w:rPr>
+        <w:t xml:space="preserve">r)  </w:t>
+      </w:r>
+      <w:r>
+        <w:rPr>
+          <w:sz w:val="24"/>
+          <w:szCs w:val="24"/>
+        </w:rPr>
+        <w:t xml:space="preserve"> </w:t>
+      </w:r>
+      <w:proofErr w:type="gramEnd"/>
+      <w:r>
+        <w:rPr>
+          <w:sz w:val="24"/>
+          <w:szCs w:val="24"/>
+        </w:rPr>
+        <w:t xml:space="preserve">        </w:t>
+      </w:r>
+      <w:r>
+        <w:rPr>
+          <w:sz w:val="24"/>
+          <w:szCs w:val="24"/>
+        </w:rPr>
+        <w:t xml:space="preserve">           </w:t>
+      </w:r>
+      <w:proofErr w:type="gramStart"/>
+      <w:r>
+        <w:rPr>
+          <w:sz w:val="24"/>
+          <w:szCs w:val="24"/>
+        </w:rPr>
+        <w:t xml:space="preserve">   </w:t>
+      </w:r>
+      <w:r>
+        <w:rPr>
+          <w:sz w:val="24"/>
+          <w:szCs w:val="24"/>
+        </w:rPr>
+        <w:t>(</w:t>
       </w:r>
       <w:proofErr w:type="gramEnd"/>
       <w:r>
@@ -13376,403 +13876,6 @@
           <w:sz w:val="24"/>
           <w:szCs w:val="24"/>
         </w:rPr>
-        <w:t>41)</w:t>
-      </w:r>
-    </w:p>
-    <w:p>
-      <w:pPr>
-        <w:spacing w:after="0" w:line="360" w:lineRule="auto"/>
-        <w:jc w:val="both"/>
-        <w:rPr>
-          <w:sz w:val="24"/>
-          <w:szCs w:val="24"/>
-        </w:rPr>
-      </w:pPr>
-      <w:r>
-        <w:rPr>
-          <w:sz w:val="24"/>
-          <w:szCs w:val="24"/>
-        </w:rPr>
-        <w:t>si assumerà_</w:t>
-      </w:r>
-    </w:p>
-    <w:p>
-      <w:pPr>
-        <w:spacing w:after="0" w:line="360" w:lineRule="auto"/>
-        <w:ind w:left="3540" w:firstLine="708"/>
-        <w:jc w:val="both"/>
-        <w:rPr>
-          <w:sz w:val="24"/>
-          <w:szCs w:val="24"/>
-        </w:rPr>
-      </w:pPr>
-      <w:r>
-        <w:rPr>
-          <w:sz w:val="24"/>
-          <w:szCs w:val="24"/>
-        </w:rPr>
-        <w:t xml:space="preserve">Δ (r) = </w:t>
-      </w:r>
-      <w:r>
-        <w:rPr>
-          <w:rFonts w:cs="Calibri"/>
-          <w:sz w:val="24"/>
-          <w:szCs w:val="24"/>
-        </w:rPr>
-        <w:t>α</w:t>
-      </w:r>
-      <w:r>
-        <w:rPr>
-          <w:sz w:val="24"/>
-          <w:szCs w:val="24"/>
-          <w:vertAlign w:val="subscript"/>
-        </w:rPr>
-        <w:t>5</w:t>
-      </w:r>
-      <w:r>
-        <w:rPr>
-          <w:sz w:val="24"/>
-          <w:szCs w:val="24"/>
-        </w:rPr>
-        <w:t xml:space="preserve"> P</w:t>
-      </w:r>
-      <w:proofErr w:type="gramStart"/>
-      <w:r>
-        <w:rPr>
-          <w:sz w:val="24"/>
-          <w:szCs w:val="24"/>
-        </w:rPr>
-        <w:t>’( r</w:t>
-      </w:r>
-      <w:proofErr w:type="gramEnd"/>
-      <w:r>
-        <w:rPr>
-          <w:sz w:val="24"/>
-          <w:szCs w:val="24"/>
-        </w:rPr>
-        <w:t xml:space="preserve"> )      </w:t>
-      </w:r>
-      <w:r>
-        <w:rPr>
-          <w:sz w:val="24"/>
-          <w:szCs w:val="24"/>
-        </w:rPr>
-        <w:t xml:space="preserve">                </w:t>
-      </w:r>
-      <w:proofErr w:type="gramStart"/>
-      <w:r>
-        <w:rPr>
-          <w:sz w:val="24"/>
-          <w:szCs w:val="24"/>
-        </w:rPr>
-        <w:t xml:space="preserve">  </w:t>
-      </w:r>
-      <w:r>
-        <w:rPr>
-          <w:sz w:val="24"/>
-          <w:szCs w:val="24"/>
-        </w:rPr>
-        <w:t xml:space="preserve"> (</w:t>
-      </w:r>
-      <w:proofErr w:type="gramEnd"/>
-      <w:r>
-        <w:rPr>
-          <w:sz w:val="24"/>
-          <w:szCs w:val="24"/>
-        </w:rPr>
-        <w:t>5.</w:t>
-      </w:r>
-      <w:r>
-        <w:rPr>
-          <w:sz w:val="24"/>
-          <w:szCs w:val="24"/>
-        </w:rPr>
-        <w:t>42)</w:t>
-      </w:r>
-    </w:p>
-    <w:p>
-      <w:pPr>
-        <w:spacing w:after="0" w:line="360" w:lineRule="auto"/>
-        <w:jc w:val="both"/>
-        <w:rPr>
-          <w:sz w:val="24"/>
-          <w:szCs w:val="24"/>
-        </w:rPr>
-      </w:pPr>
-    </w:p>
-    <w:p>
-      <w:pPr>
-        <w:spacing w:after="0" w:line="360" w:lineRule="auto"/>
-        <w:ind w:firstLine="708"/>
-        <w:jc w:val="both"/>
-        <w:rPr>
-          <w:sz w:val="24"/>
-          <w:szCs w:val="24"/>
-        </w:rPr>
-      </w:pPr>
-      <w:r>
-        <w:rPr>
-          <w:sz w:val="24"/>
-          <w:szCs w:val="24"/>
-        </w:rPr>
-        <w:t xml:space="preserve">La distribuzione mensile dei prelievi Δ j(r) per la generica traversa r si può assumere proporzionale ai valori del deflusso netto </w:t>
-      </w:r>
-      <w:proofErr w:type="spellStart"/>
-      <w:r>
-        <w:rPr>
-          <w:sz w:val="24"/>
-          <w:szCs w:val="24"/>
-        </w:rPr>
-        <w:t>P’j</w:t>
-      </w:r>
-      <w:proofErr w:type="spellEnd"/>
-      <w:r>
-        <w:rPr>
-          <w:sz w:val="24"/>
-          <w:szCs w:val="24"/>
-        </w:rPr>
-        <w:t>(r). Pertanto, posto:</w:t>
-      </w:r>
-    </w:p>
-    <w:p>
-      <w:pPr>
-        <w:spacing w:after="0" w:line="360" w:lineRule="auto"/>
-        <w:ind w:left="3540" w:firstLine="708"/>
-        <w:jc w:val="both"/>
-        <w:rPr>
-          <w:sz w:val="24"/>
-          <w:szCs w:val="24"/>
-        </w:rPr>
-      </w:pPr>
-      <w:r>
-        <w:rPr>
-          <w:rFonts w:cs="Calibri"/>
-          <w:sz w:val="24"/>
-          <w:szCs w:val="24"/>
-        </w:rPr>
-        <w:t>α</w:t>
-      </w:r>
-      <w:r>
-        <w:rPr>
-          <w:sz w:val="24"/>
-          <w:szCs w:val="24"/>
-          <w:vertAlign w:val="subscript"/>
-        </w:rPr>
-        <w:t xml:space="preserve">6 </w:t>
-      </w:r>
-      <w:r>
-        <w:rPr>
-          <w:sz w:val="24"/>
-          <w:szCs w:val="24"/>
-        </w:rPr>
-        <w:t xml:space="preserve">= </w:t>
-      </w:r>
-      <w:r>
-        <w:rPr>
-          <w:sz w:val="24"/>
-          <w:szCs w:val="24"/>
-        </w:rPr>
-        <w:t xml:space="preserve">Δ (r) </w:t>
-      </w:r>
-      <w:r>
-        <w:rPr>
-          <w:sz w:val="24"/>
-          <w:szCs w:val="24"/>
-        </w:rPr>
-        <w:t>/ P’(</w:t>
-      </w:r>
-      <w:proofErr w:type="gramStart"/>
-      <w:r>
-        <w:rPr>
-          <w:sz w:val="24"/>
-          <w:szCs w:val="24"/>
-        </w:rPr>
-        <w:t xml:space="preserve">r)  </w:t>
-      </w:r>
-      <w:r>
-        <w:rPr>
-          <w:sz w:val="24"/>
-          <w:szCs w:val="24"/>
-        </w:rPr>
-        <w:t xml:space="preserve"> </w:t>
-      </w:r>
-      <w:proofErr w:type="gramEnd"/>
-      <w:r>
-        <w:rPr>
-          <w:sz w:val="24"/>
-          <w:szCs w:val="24"/>
-        </w:rPr>
-        <w:t xml:space="preserve">      </w:t>
-      </w:r>
-      <w:r>
-        <w:rPr>
-          <w:sz w:val="24"/>
-          <w:szCs w:val="24"/>
-        </w:rPr>
-        <w:t xml:space="preserve">            </w:t>
-      </w:r>
-      <w:proofErr w:type="gramStart"/>
-      <w:r>
-        <w:rPr>
-          <w:sz w:val="24"/>
-          <w:szCs w:val="24"/>
-        </w:rPr>
-        <w:t xml:space="preserve">  </w:t>
-      </w:r>
-      <w:r>
-        <w:rPr>
-          <w:sz w:val="24"/>
-          <w:szCs w:val="24"/>
-        </w:rPr>
-        <w:t xml:space="preserve"> (</w:t>
-      </w:r>
-      <w:proofErr w:type="gramEnd"/>
-      <w:r>
-        <w:rPr>
-          <w:sz w:val="24"/>
-          <w:szCs w:val="24"/>
-        </w:rPr>
-        <w:t>5.</w:t>
-      </w:r>
-      <w:r>
-        <w:rPr>
-          <w:sz w:val="24"/>
-          <w:szCs w:val="24"/>
-        </w:rPr>
-        <w:t xml:space="preserve">43)    </w:t>
-      </w:r>
-    </w:p>
-    <w:p>
-      <w:pPr>
-        <w:spacing w:after="0" w:line="360" w:lineRule="auto"/>
-        <w:jc w:val="both"/>
-        <w:rPr>
-          <w:sz w:val="24"/>
-          <w:szCs w:val="24"/>
-        </w:rPr>
-      </w:pPr>
-      <w:r>
-        <w:rPr>
-          <w:sz w:val="24"/>
-          <w:szCs w:val="24"/>
-        </w:rPr>
-        <w:t>sarà:</w:t>
-      </w:r>
-    </w:p>
-    <w:p>
-      <w:pPr>
-        <w:spacing w:after="0" w:line="360" w:lineRule="auto"/>
-        <w:ind w:left="3540" w:firstLine="708"/>
-        <w:jc w:val="both"/>
-        <w:rPr>
-          <w:sz w:val="24"/>
-          <w:szCs w:val="24"/>
-        </w:rPr>
-      </w:pPr>
-      <w:r>
-        <w:rPr>
-          <w:sz w:val="24"/>
-          <w:szCs w:val="24"/>
-        </w:rPr>
-        <w:t>Δ j(r) =</w:t>
-      </w:r>
-      <w:r>
-        <w:rPr>
-          <w:rFonts w:cs="Calibri"/>
-          <w:sz w:val="24"/>
-          <w:szCs w:val="24"/>
-        </w:rPr>
-        <w:t xml:space="preserve"> α</w:t>
-      </w:r>
-      <w:r>
-        <w:rPr>
-          <w:sz w:val="24"/>
-          <w:szCs w:val="24"/>
-          <w:vertAlign w:val="subscript"/>
-        </w:rPr>
-        <w:t>6</w:t>
-      </w:r>
-      <w:r>
-        <w:rPr>
-          <w:sz w:val="24"/>
-          <w:szCs w:val="24"/>
-        </w:rPr>
-        <w:t xml:space="preserve"> </w:t>
-      </w:r>
-      <w:proofErr w:type="spellStart"/>
-      <w:r>
-        <w:rPr>
-          <w:sz w:val="24"/>
-          <w:szCs w:val="24"/>
-        </w:rPr>
-        <w:t>P’j</w:t>
-      </w:r>
-      <w:proofErr w:type="spellEnd"/>
-      <w:r>
-        <w:rPr>
-          <w:sz w:val="24"/>
-          <w:szCs w:val="24"/>
-        </w:rPr>
-        <w:t>(</w:t>
-      </w:r>
-      <w:proofErr w:type="gramStart"/>
-      <w:r>
-        <w:rPr>
-          <w:sz w:val="24"/>
-          <w:szCs w:val="24"/>
-        </w:rPr>
-        <w:t xml:space="preserve">r)  </w:t>
-      </w:r>
-      <w:r>
-        <w:rPr>
-          <w:sz w:val="24"/>
-          <w:szCs w:val="24"/>
-        </w:rPr>
-        <w:t xml:space="preserve"> </w:t>
-      </w:r>
-      <w:proofErr w:type="gramEnd"/>
-      <w:r>
-        <w:rPr>
-          <w:sz w:val="24"/>
-          <w:szCs w:val="24"/>
-        </w:rPr>
-        <w:t xml:space="preserve">        </w:t>
-      </w:r>
-      <w:r>
-        <w:rPr>
-          <w:sz w:val="24"/>
-          <w:szCs w:val="24"/>
-        </w:rPr>
-        <w:t xml:space="preserve">           </w:t>
-      </w:r>
-      <w:proofErr w:type="gramStart"/>
-      <w:r>
-        <w:rPr>
-          <w:sz w:val="24"/>
-          <w:szCs w:val="24"/>
-        </w:rPr>
-        <w:t xml:space="preserve">   </w:t>
-      </w:r>
-      <w:r>
-        <w:rPr>
-          <w:sz w:val="24"/>
-          <w:szCs w:val="24"/>
-        </w:rPr>
-        <w:t>(</w:t>
-      </w:r>
-      <w:proofErr w:type="gramEnd"/>
-      <w:r>
-        <w:rPr>
-          <w:sz w:val="24"/>
-          <w:szCs w:val="24"/>
-        </w:rPr>
-        <w:t>5.</w:t>
-      </w:r>
-      <w:r>
-        <w:rPr>
-          <w:sz w:val="24"/>
-          <w:szCs w:val="24"/>
-        </w:rPr>
         <w:t>44)</w:t>
       </w:r>
     </w:p>
@@ -13790,7 +13893,21 @@
           <w:sz w:val="24"/>
           <w:szCs w:val="24"/>
         </w:rPr>
-        <w:t xml:space="preserve">I valori di Δ j(r) sono </w:t>
+        <w:t>I valori di Δ</w:t>
+      </w:r>
+      <w:r>
+        <w:rPr>
+          <w:sz w:val="24"/>
+          <w:szCs w:val="24"/>
+        </w:rPr>
+        <w:t>’</w:t>
+      </w:r>
+      <w:r>
+        <w:rPr>
+          <w:sz w:val="24"/>
+          <w:szCs w:val="24"/>
+        </w:rPr>
+        <w:t xml:space="preserve"> j(r) sono </w:t>
       </w:r>
       <w:r>
         <w:rPr>

</xml_diff>